<commit_message>
feat: add demo banner and align docs to one-pager edits
- Add dark demo banner at top of site with links to One Pager and Full Strategy Doc
- Update Phase 2 to Q3 2026 with corrected flows (Text iQ, 360 project creation, benchmark builder)
- Update Phase 3 description to match one-pager (continuous improvements framing)
- Fix configuration gap copy: "without sufficient guidance"
- Regenerate both strategy doc and one-pager

Co-Authored-By: Claude Sonnet 4.6 <noreply@anthropic.com>
</commit_message>
<xml_diff>
--- a/docs/2026-EX-Maturity-Strategy-onepager.docx
+++ b/docs/2026-EX-Maturity-Strategy-onepager.docx
@@ -243,7 +243,7 @@
                 <w:sz w:val="19"/>
                 <w:szCs w:val="19"/>
               </w:rPr>
-              <w:t xml:space="preserve">Even when customers are aware of a feature, setting it up requires navigating multiple screens without guidance.</w:t>
+              <w:t xml:space="preserve">Even when customers are aware of a feature, setting it up requires navigating multiple screens without sufficient guidance.</w:t>
             </w:r>
           </w:p>
         </w:tc>
@@ -1004,7 +1004,7 @@
                 <w:sz w:val="19"/>
                 <w:szCs w:val="19"/>
               </w:rPr>
-              <w:t xml:space="preserve">Phase 2: Priority Guided Experiences (Q2 2026)</w:t>
+              <w:t xml:space="preserve">Phase 2: Priority Guided Experiences (Q3 2026)</w:t>
             </w:r>
           </w:p>
         </w:tc>
@@ -1038,7 +1038,7 @@
                 <w:sz w:val="19"/>
                 <w:szCs w:val="19"/>
               </w:rPr>
-              <w:t xml:space="preserve">Three high-impact guided flows: Text iQ setup, Pulse survey creation, Manager dashboard configuration.</w:t>
+              <w:t xml:space="preserve">Three high-impact guided flows: Text iQ setup, 360 project creation, benchmark builder.</w:t>
             </w:r>
           </w:p>
         </w:tc>
@@ -1074,7 +1074,7 @@
                 <w:sz w:val="19"/>
                 <w:szCs w:val="19"/>
               </w:rPr>
-              <w:t xml:space="preserve">Phase 3: Extended Guided Experiences (Q4 2026)</w:t>
+              <w:t xml:space="preserve">Phase 3: Extended Guided Experiences (Q4 2026 onward)</w:t>
             </w:r>
           </w:p>
         </w:tc>
@@ -1108,7 +1108,7 @@
                 <w:sz w:val="19"/>
                 <w:szCs w:val="19"/>
               </w:rPr>
-              <w:t xml:space="preserve">Remaining recommendations get guided flows. Qualtrics Assist integration for natural-language guidance.</w:t>
+              <w:t xml:space="preserve">Remaining recommendations get guided flows &amp; continuous improvements to existing flows.</w:t>
             </w:r>
           </w:p>
         </w:tc>

</xml_diff>